<commit_message>
Permission document in official format, officials list, AI section fixes
</commit_message>
<xml_diff>
--- a/backend/storage/outputs/2_v1.docx
+++ b/backend/storage/outputs/2_v1.docx
@@ -39,7 +39,7 @@
           <w:sz w:val="22"/>
           <w:szCs w:val="22"/>
         </w:rPr>
-        <w:t xml:space="preserve">Date: 07 October 2026</w:t>
+        <w:t xml:space="preserve">Date: 11 October 2026</w:t>
       </w:r>
     </w:p>
     <w:p>
@@ -65,7 +65,7 @@
           <w:sz w:val="22"/>
           <w:szCs w:val="22"/>
         </w:rPr>
-        <w:t xml:space="preserve">The Dean (Student Welfare)</w:t>
+        <w:t xml:space="preserve">Dr. Sankita J. Patel</w:t>
       </w:r>
     </w:p>
     <w:p>
@@ -103,7 +103,7 @@
           <w:sz w:val="22"/>
           <w:szCs w:val="22"/>
         </w:rPr>
-        <w:t xml:space="preserve">Request for permission to organise TechFest 2027</w:t>
+        <w:t xml:space="preserve">Request for permission to organise Incursion</w:t>
       </w:r>
     </w:p>
     <w:p>
@@ -129,20 +129,7 @@
           <w:sz w:val="22"/>
           <w:szCs w:val="22"/>
         </w:rPr>
-        <w:t xml:space="preserve">The ACM Student Chapter, SVNIT Surat respectfully requests your permission to organise TechFest 2027 on 12 February 2027 at Seminar Hall.</w:t>
-      </w:r>
-    </w:p>
-    <w:p>
-      <w:pPr>
-        <w:spacing w:after="140" w:line="276"/>
-      </w:pPr>
-      <w:r>
-        <w:rPr>
-          <w:rFonts w:ascii="Calibri" w:cs="Calibri" w:eastAsia="Calibri" w:hAnsi="Calibri"/>
-          <w:sz w:val="22"/>
-          <w:szCs w:val="22"/>
-        </w:rPr>
-        <w:t xml:space="preserve">The purpose of TechFest 2027 is to conduct a two‑hour coding contest for first‑year students, scheduled for 12 February 2027 at the Seminar Hall.</w:t>
+        <w:t xml:space="preserve">The ACM Student Chapter, SVNIT Surat respectfully requests your permission to organise Incursion on 20-10-2026 at CSE hall.</w:t>
       </w:r>
     </w:p>
     <w:p>
@@ -230,7 +217,7 @@
                 <w:sz w:val="22"/>
                 <w:szCs w:val="22"/>
               </w:rPr>
-              <w:t xml:space="preserve">TechFest 2027</w:t>
+              <w:t xml:space="preserve">Incursion</w:t>
             </w:r>
           </w:p>
         </w:tc>
@@ -291,7 +278,7 @@
                 <w:sz w:val="22"/>
                 <w:szCs w:val="22"/>
               </w:rPr>
-              <w:t xml:space="preserve">12 February 2027</w:t>
+              <w:t xml:space="preserve">20-10-2026</w:t>
             </w:r>
           </w:p>
         </w:tc>
@@ -352,7 +339,7 @@
                 <w:sz w:val="22"/>
                 <w:szCs w:val="22"/>
               </w:rPr>
-              <w:t xml:space="preserve">Seminar Hall</w:t>
+              <w:t xml:space="preserve">CSE hall</w:t>
             </w:r>
           </w:p>
         </w:tc>
@@ -413,7 +400,7 @@
                 <w:sz w:val="22"/>
                 <w:szCs w:val="22"/>
               </w:rPr>
-              <w:t xml:space="preserve">Prof. Mehta</w:t>
+              <w:t xml:space="preserve">Dr. Balu Parne</w:t>
             </w:r>
           </w:p>
         </w:tc>
@@ -600,7 +587,7 @@
                 <w:sz w:val="22"/>
                 <w:szCs w:val="22"/>
               </w:rPr>
-              <w:t xml:space="preserve">Prof. Mehta</w:t>
+              <w:t xml:space="preserve">Dr. Balu Parne</w:t>
             </w:r>
           </w:p>
           <w:p>

</xml_diff>